<commit_message>
Mise à jour pour la V2
</commit_message>
<xml_diff>
--- a/Cahiers des charges/Word/CAHIER DE CHARGES - KWISMO.docx
+++ b/Cahiers des charges/Word/CAHIER DE CHARGES - KWISMO.docx
@@ -46,7 +46,7 @@
           <w:sz w:val="22"/>
           <w:szCs w:val="22"/>
         </w:rPr>
-        <w:t>2</w:t>
+        <w:t>3</w:t>
       </w:r>
     </w:p>
     <w:p>
@@ -95,6 +95,9 @@
         <w:jc w:val="center"/>
       </w:pPr>
       <w:r>
+        <w:rPr>
+          <w:noProof/>
+        </w:rPr>
         <w:drawing>
           <wp:inline distT="0" distB="0" distL="0" distR="0" wp14:anchorId="24140934" wp14:editId="358392B1">
             <wp:extent cx="2018855" cy="1009650"/>
@@ -161,7 +164,20 @@
     <w:p>
       <w:pPr>
         <w:jc w:val="center"/>
-      </w:pPr>
+        <w:rPr>
+          <w:b/>
+          <w:bCs/>
+        </w:rPr>
+      </w:pPr>
+      <w:r>
+        <w:rPr>
+          <w:b/>
+          <w:bCs/>
+          <w:sz w:val="44"/>
+          <w:szCs w:val="44"/>
+        </w:rPr>
+        <w:t>SAFESEND</w:t>
+      </w:r>
     </w:p>
     <w:p>
       <w:pPr>
@@ -322,7 +338,19 @@
         <w:rPr>
           <w:lang w:val="en-CA"/>
         </w:rPr>
-        <w:t xml:space="preserve">Sonia </w:t>
+        <w:t>Sonia</w:t>
+      </w:r>
+      <w:r>
+        <w:rPr>
+          <w:lang w:val="en-CA"/>
+        </w:rPr>
+        <w:t xml:space="preserve"> </w:t>
+      </w:r>
+      <w:r>
+        <w:rPr>
+          <w:lang w:val="en-CA"/>
+        </w:rPr>
+        <w:t xml:space="preserve">Tchakounte </w:t>
       </w:r>
       <w:r>
         <w:rPr>
@@ -334,12 +362,6 @@
         <w:rPr>
           <w:lang w:val="en-CA"/>
         </w:rPr>
-        <w:t xml:space="preserve">Tchakounte </w:t>
-      </w:r>
-      <w:r>
-        <w:rPr>
-          <w:lang w:val="en-CA"/>
-        </w:rPr>
         <w:t>(Data AI)</w:t>
       </w:r>
     </w:p>
@@ -373,7 +395,6 @@
         <w:rPr>
           <w:b/>
           <w:bCs/>
-          <w:lang w:val="en-CA"/>
         </w:rPr>
       </w:pPr>
       <w:r>
@@ -382,7 +403,6 @@
           <w:bCs/>
           <w:sz w:val="36"/>
           <w:szCs w:val="36"/>
-          <w:lang w:val="en-CA"/>
         </w:rPr>
         <w:t>Orange Digital Center</w:t>
       </w:r>
@@ -390,26 +410,24 @@
     <w:p>
       <w:pPr>
         <w:jc w:val="both"/>
-        <w:rPr>
-          <w:lang w:val="en-CA"/>
-        </w:rPr>
-      </w:pPr>
-    </w:p>
-    <w:p>
-      <w:pPr>
-        <w:rPr>
-          <w:lang w:val="en-CA"/>
-        </w:rPr>
-      </w:pPr>
-      <w:r>
-        <w:rPr>
-          <w:lang w:val="en-CA"/>
-        </w:rPr>
+      </w:pPr>
+    </w:p>
+    <w:p>
+      <w:r>
         <w:br w:type="page"/>
       </w:r>
     </w:p>
     <w:sdt>
       <w:sdtPr>
+        <w:rPr>
+          <w:rFonts w:asciiTheme="minorHAnsi" w:eastAsiaTheme="minorHAnsi" w:hAnsiTheme="minorHAnsi" w:cstheme="minorBidi"/>
+          <w:color w:val="auto"/>
+          <w:kern w:val="2"/>
+          <w:sz w:val="24"/>
+          <w:szCs w:val="24"/>
+          <w:lang w:eastAsia="en-US"/>
+          <w14:ligatures w14:val="standardContextual"/>
+        </w:rPr>
         <w:id w:val="604391997"/>
         <w:docPartObj>
           <w:docPartGallery w:val="Table of Contents"/>
@@ -418,15 +436,8 @@
       </w:sdtPr>
       <w:sdtEndPr>
         <w:rPr>
-          <w:rFonts w:asciiTheme="minorHAnsi" w:eastAsiaTheme="minorHAnsi" w:hAnsiTheme="minorHAnsi" w:cstheme="minorBidi"/>
           <w:b/>
           <w:bCs/>
-          <w:color w:val="auto"/>
-          <w:kern w:val="2"/>
-          <w:sz w:val="24"/>
-          <w:szCs w:val="24"/>
-          <w:lang w:eastAsia="en-US"/>
-          <w14:ligatures w14:val="standardContextual"/>
         </w:rPr>
       </w:sdtEndPr>
       <w:sdtContent>
@@ -4237,7 +4248,6 @@
         </w:rPr>
         <w:t xml:space="preserve">Frontend </w:t>
       </w:r>
-      <w:proofErr w:type="gramStart"/>
       <w:r>
         <w:rPr>
           <w:lang w:val="en-CA"/>
@@ -4250,7 +4260,6 @@
         </w:rPr>
         <w:t> :</w:t>
       </w:r>
-      <w:proofErr w:type="gramEnd"/>
       <w:r>
         <w:rPr>
           <w:lang w:val="en-CA"/>
@@ -5114,9 +5123,9 @@
           <w:noProof/>
         </w:rPr>
         <w:drawing>
-          <wp:inline distT="0" distB="0" distL="0" distR="0" wp14:anchorId="67204973" wp14:editId="32F3AAF5">
-            <wp:extent cx="5759450" cy="4739005"/>
-            <wp:effectExtent l="0" t="0" r="0" b="4445"/>
+          <wp:inline distT="0" distB="0" distL="0" distR="0" wp14:anchorId="67204973" wp14:editId="1CC508DC">
+            <wp:extent cx="6296025" cy="6096261"/>
+            <wp:effectExtent l="0" t="0" r="0" b="0"/>
             <wp:docPr id="166803981" name="Image 1"/>
             <wp:cNvGraphicFramePr>
               <a:graphicFrameLocks xmlns:a="http://schemas.openxmlformats.org/drawingml/2006/main" noChangeAspect="1"/>
@@ -5125,7 +5134,7 @@
               <a:graphicData uri="http://schemas.openxmlformats.org/drawingml/2006/picture">
                 <pic:pic xmlns:pic="http://schemas.openxmlformats.org/drawingml/2006/picture">
                   <pic:nvPicPr>
-                    <pic:cNvPr id="0" name="Picture 1"/>
+                    <pic:cNvPr id="166803981" name="Image 1"/>
                     <pic:cNvPicPr>
                       <a:picLocks noChangeAspect="1" noChangeArrowheads="1"/>
                     </pic:cNvPicPr>
@@ -5138,7 +5147,6 @@
                         </a:ext>
                       </a:extLst>
                     </a:blip>
-                    <a:srcRect/>
                     <a:stretch>
                       <a:fillRect/>
                     </a:stretch>
@@ -5146,7 +5154,7 @@
                   <pic:spPr bwMode="auto">
                     <a:xfrm>
                       <a:off x="0" y="0"/>
-                      <a:ext cx="5759450" cy="4739005"/>
+                      <a:ext cx="6305978" cy="6105898"/>
                     </a:xfrm>
                     <a:prstGeom prst="rect">
                       <a:avLst/>
@@ -5172,24 +5180,14 @@
       <w:r>
         <w:t xml:space="preserve">Figure </w:t>
       </w:r>
-      <w:r>
-        <w:fldChar w:fldCharType="begin"/>
-      </w:r>
-      <w:r>
-        <w:instrText xml:space="preserve"> SEQ Figure \* ARABIC </w:instrText>
-      </w:r>
-      <w:r>
-        <w:fldChar w:fldCharType="separate"/>
-      </w:r>
-      <w:r>
-        <w:rPr>
-          <w:noProof/>
-        </w:rPr>
-        <w:t>1</w:t>
-      </w:r>
-      <w:r>
-        <w:fldChar w:fldCharType="end"/>
-      </w:r>
+      <w:fldSimple w:instr=" SEQ Figure \* ARABIC ">
+        <w:r>
+          <w:rPr>
+            <w:noProof/>
+          </w:rPr>
+          <w:t>1</w:t>
+        </w:r>
+      </w:fldSimple>
       <w:r>
         <w:t xml:space="preserve"> : </w:t>
       </w:r>
@@ -5276,24 +5274,14 @@
       <w:r>
         <w:t xml:space="preserve">Figure </w:t>
       </w:r>
-      <w:r>
-        <w:fldChar w:fldCharType="begin"/>
-      </w:r>
-      <w:r>
-        <w:instrText xml:space="preserve"> SEQ Figure \* ARABIC </w:instrText>
-      </w:r>
-      <w:r>
-        <w:fldChar w:fldCharType="separate"/>
-      </w:r>
-      <w:r>
-        <w:rPr>
-          <w:noProof/>
-        </w:rPr>
-        <w:t>2</w:t>
-      </w:r>
-      <w:r>
-        <w:fldChar w:fldCharType="end"/>
-      </w:r>
+      <w:fldSimple w:instr=" SEQ Figure \* ARABIC ">
+        <w:r>
+          <w:rPr>
+            <w:noProof/>
+          </w:rPr>
+          <w:t>2</w:t>
+        </w:r>
+      </w:fldSimple>
       <w:r>
         <w:t xml:space="preserve"> : </w:t>
       </w:r>
@@ -5380,24 +5368,14 @@
       <w:r>
         <w:t xml:space="preserve">Figure </w:t>
       </w:r>
-      <w:r>
-        <w:fldChar w:fldCharType="begin"/>
-      </w:r>
-      <w:r>
-        <w:instrText xml:space="preserve"> SEQ Figure \* ARABIC </w:instrText>
-      </w:r>
-      <w:r>
-        <w:fldChar w:fldCharType="separate"/>
-      </w:r>
-      <w:r>
-        <w:rPr>
-          <w:noProof/>
-        </w:rPr>
-        <w:t>3</w:t>
-      </w:r>
-      <w:r>
-        <w:fldChar w:fldCharType="end"/>
-      </w:r>
+      <w:fldSimple w:instr=" SEQ Figure \* ARABIC ">
+        <w:r>
+          <w:rPr>
+            <w:noProof/>
+          </w:rPr>
+          <w:t>3</w:t>
+        </w:r>
+      </w:fldSimple>
       <w:r>
         <w:t xml:space="preserve"> : </w:t>
       </w:r>
@@ -5483,24 +5461,14 @@
       <w:r>
         <w:t xml:space="preserve">Figure </w:t>
       </w:r>
-      <w:r>
-        <w:fldChar w:fldCharType="begin"/>
-      </w:r>
-      <w:r>
-        <w:instrText xml:space="preserve"> SEQ Figure \* ARABIC </w:instrText>
-      </w:r>
-      <w:r>
-        <w:fldChar w:fldCharType="separate"/>
-      </w:r>
-      <w:r>
-        <w:rPr>
-          <w:noProof/>
-        </w:rPr>
-        <w:t>4</w:t>
-      </w:r>
-      <w:r>
-        <w:fldChar w:fldCharType="end"/>
-      </w:r>
+      <w:fldSimple w:instr=" SEQ Figure \* ARABIC ">
+        <w:r>
+          <w:rPr>
+            <w:noProof/>
+          </w:rPr>
+          <w:t>4</w:t>
+        </w:r>
+      </w:fldSimple>
       <w:r>
         <w:t xml:space="preserve"> : </w:t>
       </w:r>
@@ -5537,8 +5505,8 @@
           <w:noProof/>
         </w:rPr>
         <w:drawing>
-          <wp:inline distT="0" distB="0" distL="0" distR="0" wp14:anchorId="5D72EAC4" wp14:editId="11FED45A">
-            <wp:extent cx="5759450" cy="3395980"/>
+          <wp:inline distT="0" distB="0" distL="0" distR="0" wp14:anchorId="5D72EAC4" wp14:editId="0B8D2408">
+            <wp:extent cx="3353301" cy="3395980"/>
             <wp:effectExtent l="0" t="0" r="0" b="0"/>
             <wp:docPr id="1230010952" name="Image 16"/>
             <wp:cNvGraphicFramePr>
@@ -5548,20 +5516,19 @@
               <a:graphicData uri="http://schemas.openxmlformats.org/drawingml/2006/picture">
                 <pic:pic xmlns:pic="http://schemas.openxmlformats.org/drawingml/2006/picture">
                   <pic:nvPicPr>
-                    <pic:cNvPr id="0" name="Picture 64"/>
+                    <pic:cNvPr id="1230010952" name="Image 16"/>
                     <pic:cNvPicPr>
                       <a:picLocks noChangeAspect="1" noChangeArrowheads="1"/>
                     </pic:cNvPicPr>
                   </pic:nvPicPr>
                   <pic:blipFill>
-                    <a:blip r:embed="rId13">
+                    <a:blip r:embed="rId13" cstate="print">
                       <a:extLst>
                         <a:ext uri="{28A0092B-C50C-407E-A947-70E740481C1C}">
                           <a14:useLocalDpi xmlns:a14="http://schemas.microsoft.com/office/drawing/2010/main" val="0"/>
                         </a:ext>
                       </a:extLst>
                     </a:blip>
-                    <a:srcRect/>
                     <a:stretch>
                       <a:fillRect/>
                     </a:stretch>
@@ -5569,7 +5536,7 @@
                   <pic:spPr bwMode="auto">
                     <a:xfrm>
                       <a:off x="0" y="0"/>
-                      <a:ext cx="5759450" cy="3395980"/>
+                      <a:ext cx="3353301" cy="3395980"/>
                     </a:xfrm>
                     <a:prstGeom prst="rect">
                       <a:avLst/>
@@ -5594,32 +5561,19 @@
       <w:r>
         <w:t xml:space="preserve">Figure </w:t>
       </w:r>
-      <w:r>
-        <w:fldChar w:fldCharType="begin"/>
-      </w:r>
-      <w:r>
-        <w:instrText xml:space="preserve"> SEQ Figure \* ARABIC </w:instrText>
-      </w:r>
-      <w:r>
-        <w:fldChar w:fldCharType="separate"/>
-      </w:r>
-      <w:r>
-        <w:rPr>
-          <w:noProof/>
-        </w:rPr>
-        <w:t>5</w:t>
-      </w:r>
-      <w:r>
-        <w:fldChar w:fldCharType="end"/>
-      </w:r>
+      <w:fldSimple w:instr=" SEQ Figure \* ARABIC ">
+        <w:r>
+          <w:rPr>
+            <w:noProof/>
+          </w:rPr>
+          <w:t>5</w:t>
+        </w:r>
+      </w:fldSimple>
       <w:r>
         <w:t xml:space="preserve"> : </w:t>
       </w:r>
       <w:r>
-        <w:t>Diagramme de Séquence -</w:t>
-      </w:r>
-      <w:r>
-        <w:t xml:space="preserve"> </w:t>
+        <w:t xml:space="preserve">Diagramme de Séquence - </w:t>
       </w:r>
       <w:r>
         <w:t>Authentifier &amp; Se connecter avec OT</w:t>
@@ -5636,8 +5590,8 @@
           <w:noProof/>
         </w:rPr>
         <w:drawing>
-          <wp:inline distT="0" distB="0" distL="0" distR="0" wp14:anchorId="146D81A2" wp14:editId="0DC40259">
-            <wp:extent cx="5759450" cy="3881755"/>
+          <wp:inline distT="0" distB="0" distL="0" distR="0" wp14:anchorId="146D81A2" wp14:editId="3C0CD5BA">
+            <wp:extent cx="5758997" cy="3881755"/>
             <wp:effectExtent l="0" t="0" r="0" b="4445"/>
             <wp:docPr id="1542332539" name="Image 20"/>
             <wp:cNvGraphicFramePr>
@@ -5647,7 +5601,7 @@
               <a:graphicData uri="http://schemas.openxmlformats.org/drawingml/2006/picture">
                 <pic:pic xmlns:pic="http://schemas.openxmlformats.org/drawingml/2006/picture">
                   <pic:nvPicPr>
-                    <pic:cNvPr id="0" name="Picture 81"/>
+                    <pic:cNvPr id="1542332539" name="Image 20"/>
                     <pic:cNvPicPr>
                       <a:picLocks noChangeAspect="1" noChangeArrowheads="1"/>
                     </pic:cNvPicPr>
@@ -5660,7 +5614,6 @@
                         </a:ext>
                       </a:extLst>
                     </a:blip>
-                    <a:srcRect/>
                     <a:stretch>
                       <a:fillRect/>
                     </a:stretch>
@@ -5668,7 +5621,7 @@
                   <pic:spPr bwMode="auto">
                     <a:xfrm>
                       <a:off x="0" y="0"/>
-                      <a:ext cx="5759450" cy="3881755"/>
+                      <a:ext cx="5758997" cy="3881755"/>
                     </a:xfrm>
                     <a:prstGeom prst="rect">
                       <a:avLst/>
@@ -5693,32 +5646,19 @@
       <w:r>
         <w:t xml:space="preserve">Figure </w:t>
       </w:r>
-      <w:r>
-        <w:fldChar w:fldCharType="begin"/>
-      </w:r>
-      <w:r>
-        <w:instrText xml:space="preserve"> SEQ Figure \* ARABIC </w:instrText>
-      </w:r>
-      <w:r>
-        <w:fldChar w:fldCharType="separate"/>
-      </w:r>
-      <w:r>
-        <w:rPr>
-          <w:noProof/>
-        </w:rPr>
-        <w:t>6</w:t>
-      </w:r>
-      <w:r>
-        <w:fldChar w:fldCharType="end"/>
-      </w:r>
+      <w:fldSimple w:instr=" SEQ Figure \* ARABIC ">
+        <w:r>
+          <w:rPr>
+            <w:noProof/>
+          </w:rPr>
+          <w:t>6</w:t>
+        </w:r>
+      </w:fldSimple>
       <w:r>
         <w:t xml:space="preserve"> : </w:t>
       </w:r>
       <w:r>
-        <w:t>Diagramme de Séquence -</w:t>
-      </w:r>
-      <w:r>
-        <w:t xml:space="preserve"> </w:t>
+        <w:t xml:space="preserve">Diagramme de Séquence - </w:t>
       </w:r>
       <w:r>
         <w:t>Inscrire un utilisateur</w:t>
@@ -5789,32 +5729,16 @@
       <w:r>
         <w:t xml:space="preserve">Figure </w:t>
       </w:r>
-      <w:r>
-        <w:fldChar w:fldCharType="begin"/>
-      </w:r>
-      <w:r>
-        <w:instrText xml:space="preserve"> SEQ Figure \* ARABIC </w:instrText>
-      </w:r>
-      <w:r>
-        <w:fldChar w:fldCharType="separate"/>
-      </w:r>
-      <w:r>
-        <w:rPr>
-          <w:noProof/>
-        </w:rPr>
-        <w:t>7</w:t>
-      </w:r>
-      <w:r>
-        <w:fldChar w:fldCharType="end"/>
-      </w:r>
-      <w:r>
-        <w:t xml:space="preserve"> : </w:t>
-      </w:r>
-      <w:r>
-        <w:t>Diagramme de Séquence -</w:t>
-      </w:r>
-      <w:r>
-        <w:t xml:space="preserve"> </w:t>
+      <w:fldSimple w:instr=" SEQ Figure \* ARABIC ">
+        <w:r>
+          <w:rPr>
+            <w:noProof/>
+          </w:rPr>
+          <w:t>7</w:t>
+        </w:r>
+      </w:fldSimple>
+      <w:r>
+        <w:t xml:space="preserve"> : Diagramme de Séquence - </w:t>
       </w:r>
       <w:r>
         <w:t>Détecter un appel entrant suspect</w:t>
@@ -5885,24 +5809,14 @@
       <w:r>
         <w:t xml:space="preserve">Figure </w:t>
       </w:r>
-      <w:r>
-        <w:fldChar w:fldCharType="begin"/>
-      </w:r>
-      <w:r>
-        <w:instrText xml:space="preserve"> SEQ Figure \* ARABIC </w:instrText>
-      </w:r>
-      <w:r>
-        <w:fldChar w:fldCharType="separate"/>
-      </w:r>
-      <w:r>
-        <w:rPr>
-          <w:noProof/>
-        </w:rPr>
-        <w:t>8</w:t>
-      </w:r>
-      <w:r>
-        <w:fldChar w:fldCharType="end"/>
-      </w:r>
+      <w:fldSimple w:instr=" SEQ Figure \* ARABIC ">
+        <w:r>
+          <w:rPr>
+            <w:noProof/>
+          </w:rPr>
+          <w:t>8</w:t>
+        </w:r>
+      </w:fldSimple>
       <w:r>
         <w:t xml:space="preserve"> : Diagramme de Séquence - </w:t>
       </w:r>
@@ -5976,24 +5890,14 @@
       <w:r>
         <w:t xml:space="preserve">Figure </w:t>
       </w:r>
-      <w:r>
-        <w:fldChar w:fldCharType="begin"/>
-      </w:r>
-      <w:r>
-        <w:instrText xml:space="preserve"> SEQ Figure \* ARABIC </w:instrText>
-      </w:r>
-      <w:r>
-        <w:fldChar w:fldCharType="separate"/>
-      </w:r>
-      <w:r>
-        <w:rPr>
-          <w:noProof/>
-        </w:rPr>
-        <w:t>9</w:t>
-      </w:r>
-      <w:r>
-        <w:fldChar w:fldCharType="end"/>
-      </w:r>
+      <w:fldSimple w:instr=" SEQ Figure \* ARABIC ">
+        <w:r>
+          <w:rPr>
+            <w:noProof/>
+          </w:rPr>
+          <w:t>9</w:t>
+        </w:r>
+      </w:fldSimple>
       <w:r>
         <w:t xml:space="preserve"> : </w:t>
       </w:r>
@@ -6069,24 +5973,14 @@
       <w:r>
         <w:t xml:space="preserve">Figure </w:t>
       </w:r>
-      <w:r>
-        <w:fldChar w:fldCharType="begin"/>
-      </w:r>
-      <w:r>
-        <w:instrText xml:space="preserve"> SEQ Figure \* ARABIC </w:instrText>
-      </w:r>
-      <w:r>
-        <w:fldChar w:fldCharType="separate"/>
-      </w:r>
-      <w:r>
-        <w:rPr>
-          <w:noProof/>
-        </w:rPr>
-        <w:t>10</w:t>
-      </w:r>
-      <w:r>
-        <w:fldChar w:fldCharType="end"/>
-      </w:r>
+      <w:fldSimple w:instr=" SEQ Figure \* ARABIC ">
+        <w:r>
+          <w:rPr>
+            <w:noProof/>
+          </w:rPr>
+          <w:t>10</w:t>
+        </w:r>
+      </w:fldSimple>
       <w:r>
         <w:t xml:space="preserve"> : </w:t>
       </w:r>
@@ -6107,8 +6001,8 @@
         </w:rPr>
         <w:lastRenderedPageBreak/>
         <w:drawing>
-          <wp:inline distT="0" distB="0" distL="0" distR="0" wp14:anchorId="075EFC47" wp14:editId="39E453A6">
-            <wp:extent cx="5759450" cy="3949700"/>
+          <wp:inline distT="0" distB="0" distL="0" distR="0" wp14:anchorId="075EFC47" wp14:editId="6BBDD5E8">
+            <wp:extent cx="5220912" cy="3949700"/>
             <wp:effectExtent l="0" t="0" r="0" b="0"/>
             <wp:docPr id="954851455" name="Image 26"/>
             <wp:cNvGraphicFramePr>
@@ -6118,20 +6012,19 @@
               <a:graphicData uri="http://schemas.openxmlformats.org/drawingml/2006/picture">
                 <pic:pic xmlns:pic="http://schemas.openxmlformats.org/drawingml/2006/picture">
                   <pic:nvPicPr>
-                    <pic:cNvPr id="0" name="Picture 93"/>
+                    <pic:cNvPr id="954851455" name="Image 26"/>
                     <pic:cNvPicPr>
                       <a:picLocks noChangeAspect="1" noChangeArrowheads="1"/>
                     </pic:cNvPicPr>
                   </pic:nvPicPr>
                   <pic:blipFill>
-                    <a:blip r:embed="rId19">
+                    <a:blip r:embed="rId19" cstate="print">
                       <a:extLst>
                         <a:ext uri="{28A0092B-C50C-407E-A947-70E740481C1C}">
                           <a14:useLocalDpi xmlns:a14="http://schemas.microsoft.com/office/drawing/2010/main" val="0"/>
                         </a:ext>
                       </a:extLst>
                     </a:blip>
-                    <a:srcRect/>
                     <a:stretch>
                       <a:fillRect/>
                     </a:stretch>
@@ -6139,7 +6032,7 @@
                   <pic:spPr bwMode="auto">
                     <a:xfrm>
                       <a:off x="0" y="0"/>
-                      <a:ext cx="5759450" cy="3949700"/>
+                      <a:ext cx="5220912" cy="3949700"/>
                     </a:xfrm>
                     <a:prstGeom prst="rect">
                       <a:avLst/>
@@ -6164,29 +6057,16 @@
       <w:r>
         <w:t xml:space="preserve">Figure </w:t>
       </w:r>
-      <w:r>
-        <w:fldChar w:fldCharType="begin"/>
-      </w:r>
-      <w:r>
-        <w:instrText xml:space="preserve"> SEQ Figure \* ARABIC </w:instrText>
-      </w:r>
-      <w:r>
-        <w:fldChar w:fldCharType="separate"/>
-      </w:r>
-      <w:r>
-        <w:rPr>
-          <w:noProof/>
-        </w:rPr>
-        <w:t>11</w:t>
-      </w:r>
-      <w:r>
-        <w:fldChar w:fldCharType="end"/>
-      </w:r>
-      <w:r>
-        <w:t xml:space="preserve"> : </w:t>
-      </w:r>
-      <w:r>
-        <w:t xml:space="preserve">Diagramme de Séquence - </w:t>
+      <w:fldSimple w:instr=" SEQ Figure \* ARABIC ">
+        <w:r>
+          <w:rPr>
+            <w:noProof/>
+          </w:rPr>
+          <w:t>11</w:t>
+        </w:r>
+      </w:fldSimple>
+      <w:r>
+        <w:t xml:space="preserve"> : Diagramme de Séquence - </w:t>
       </w:r>
       <w:r>
         <w:t>Transférer de l'argent</w:t>
@@ -6200,9 +6080,9 @@
           <w:noProof/>
         </w:rPr>
         <w:drawing>
-          <wp:inline distT="0" distB="0" distL="0" distR="0" wp14:anchorId="359440EB" wp14:editId="3142D011">
-            <wp:extent cx="5759450" cy="2478405"/>
-            <wp:effectExtent l="0" t="0" r="0" b="0"/>
+          <wp:inline distT="0" distB="0" distL="0" distR="0" wp14:anchorId="359440EB" wp14:editId="069DC1C6">
+            <wp:extent cx="4905375" cy="3577176"/>
+            <wp:effectExtent l="0" t="0" r="0" b="4445"/>
             <wp:docPr id="808919015" name="Image 27"/>
             <wp:cNvGraphicFramePr>
               <a:graphicFrameLocks xmlns:a="http://schemas.openxmlformats.org/drawingml/2006/main" noChangeAspect="1"/>
@@ -6211,20 +6091,19 @@
               <a:graphicData uri="http://schemas.openxmlformats.org/drawingml/2006/picture">
                 <pic:pic xmlns:pic="http://schemas.openxmlformats.org/drawingml/2006/picture">
                   <pic:nvPicPr>
-                    <pic:cNvPr id="0" name="Picture 95"/>
+                    <pic:cNvPr id="808919015" name="Image 27"/>
                     <pic:cNvPicPr>
                       <a:picLocks noChangeAspect="1" noChangeArrowheads="1"/>
                     </pic:cNvPicPr>
                   </pic:nvPicPr>
                   <pic:blipFill>
-                    <a:blip r:embed="rId20">
+                    <a:blip r:embed="rId20" cstate="print">
                       <a:extLst>
                         <a:ext uri="{28A0092B-C50C-407E-A947-70E740481C1C}">
                           <a14:useLocalDpi xmlns:a14="http://schemas.microsoft.com/office/drawing/2010/main" val="0"/>
                         </a:ext>
                       </a:extLst>
                     </a:blip>
-                    <a:srcRect/>
                     <a:stretch>
                       <a:fillRect/>
                     </a:stretch>
@@ -6232,7 +6111,7 @@
                   <pic:spPr bwMode="auto">
                     <a:xfrm>
                       <a:off x="0" y="0"/>
-                      <a:ext cx="5759450" cy="2478405"/>
+                      <a:ext cx="4919755" cy="3587663"/>
                     </a:xfrm>
                     <a:prstGeom prst="rect">
                       <a:avLst/>
@@ -6257,29 +6136,16 @@
       <w:r>
         <w:t xml:space="preserve">Figure </w:t>
       </w:r>
-      <w:r>
-        <w:fldChar w:fldCharType="begin"/>
-      </w:r>
-      <w:r>
-        <w:instrText xml:space="preserve"> SEQ Figure \* ARABIC </w:instrText>
-      </w:r>
-      <w:r>
-        <w:fldChar w:fldCharType="separate"/>
-      </w:r>
-      <w:r>
-        <w:rPr>
-          <w:noProof/>
-        </w:rPr>
-        <w:t>12</w:t>
-      </w:r>
-      <w:r>
-        <w:fldChar w:fldCharType="end"/>
-      </w:r>
-      <w:r>
-        <w:t xml:space="preserve"> : </w:t>
-      </w:r>
-      <w:r>
-        <w:t xml:space="preserve">Diagramme de Séquence - </w:t>
+      <w:fldSimple w:instr=" SEQ Figure \* ARABIC ">
+        <w:r>
+          <w:rPr>
+            <w:noProof/>
+          </w:rPr>
+          <w:t>12</w:t>
+        </w:r>
+      </w:fldSimple>
+      <w:r>
+        <w:t xml:space="preserve"> : Diagramme de Séquence - </w:t>
       </w:r>
       <w:r>
         <w:t>Envoyer un message d'alerte WhatsApp</w:t>
@@ -6351,29 +6217,16 @@
       <w:r>
         <w:t xml:space="preserve">Figure </w:t>
       </w:r>
-      <w:r>
-        <w:fldChar w:fldCharType="begin"/>
-      </w:r>
-      <w:r>
-        <w:instrText xml:space="preserve"> SEQ Figure \* ARABIC </w:instrText>
-      </w:r>
-      <w:r>
-        <w:fldChar w:fldCharType="separate"/>
-      </w:r>
-      <w:r>
-        <w:rPr>
-          <w:noProof/>
-        </w:rPr>
-        <w:t>13</w:t>
-      </w:r>
-      <w:r>
-        <w:fldChar w:fldCharType="end"/>
-      </w:r>
-      <w:r>
-        <w:t xml:space="preserve"> : </w:t>
-      </w:r>
-      <w:r>
-        <w:t xml:space="preserve">Diagramme de Séquence - </w:t>
+      <w:fldSimple w:instr=" SEQ Figure \* ARABIC ">
+        <w:r>
+          <w:rPr>
+            <w:noProof/>
+          </w:rPr>
+          <w:t>13</w:t>
+        </w:r>
+      </w:fldSimple>
+      <w:r>
+        <w:t xml:space="preserve"> : Diagramme de Séquence - </w:t>
       </w:r>
       <w:r>
         <w:t>Consulter la liste de contacts</w:t>
@@ -6444,29 +6297,16 @@
       <w:r>
         <w:t xml:space="preserve">Figure </w:t>
       </w:r>
-      <w:r>
-        <w:fldChar w:fldCharType="begin"/>
-      </w:r>
-      <w:r>
-        <w:instrText xml:space="preserve"> SEQ Figure \* ARABIC </w:instrText>
-      </w:r>
-      <w:r>
-        <w:fldChar w:fldCharType="separate"/>
-      </w:r>
-      <w:r>
-        <w:rPr>
-          <w:noProof/>
-        </w:rPr>
-        <w:t>14</w:t>
-      </w:r>
-      <w:r>
-        <w:fldChar w:fldCharType="end"/>
-      </w:r>
-      <w:r>
-        <w:t xml:space="preserve"> : </w:t>
-      </w:r>
-      <w:r>
-        <w:t xml:space="preserve">Diagramme de Séquence - </w:t>
+      <w:fldSimple w:instr=" SEQ Figure \* ARABIC ">
+        <w:r>
+          <w:rPr>
+            <w:noProof/>
+          </w:rPr>
+          <w:t>14</w:t>
+        </w:r>
+      </w:fldSimple>
+      <w:r>
+        <w:t xml:space="preserve"> : Diagramme de Séquence - </w:t>
       </w:r>
       <w:r>
         <w:t>Entraîner le modèle IA</w:t>
@@ -6561,24 +6401,14 @@
       <w:r>
         <w:t xml:space="preserve">Figure </w:t>
       </w:r>
-      <w:r>
-        <w:fldChar w:fldCharType="begin"/>
-      </w:r>
-      <w:r>
-        <w:instrText xml:space="preserve"> SEQ Figure \* ARABIC </w:instrText>
-      </w:r>
-      <w:r>
-        <w:fldChar w:fldCharType="separate"/>
-      </w:r>
-      <w:r>
-        <w:rPr>
-          <w:noProof/>
-        </w:rPr>
-        <w:t>15</w:t>
-      </w:r>
-      <w:r>
-        <w:fldChar w:fldCharType="end"/>
-      </w:r>
+      <w:fldSimple w:instr=" SEQ Figure \* ARABIC ">
+        <w:r>
+          <w:rPr>
+            <w:noProof/>
+          </w:rPr>
+          <w:t>15</w:t>
+        </w:r>
+      </w:fldSimple>
       <w:r>
         <w:t xml:space="preserve"> : </w:t>
       </w:r>
@@ -6654,24 +6484,14 @@
       <w:r>
         <w:t xml:space="preserve">Figure </w:t>
       </w:r>
-      <w:r>
-        <w:fldChar w:fldCharType="begin"/>
-      </w:r>
-      <w:r>
-        <w:instrText xml:space="preserve"> SEQ Figure \* ARABIC </w:instrText>
-      </w:r>
-      <w:r>
-        <w:fldChar w:fldCharType="separate"/>
-      </w:r>
-      <w:r>
-        <w:rPr>
-          <w:noProof/>
-        </w:rPr>
-        <w:t>16</w:t>
-      </w:r>
-      <w:r>
-        <w:fldChar w:fldCharType="end"/>
-      </w:r>
+      <w:fldSimple w:instr=" SEQ Figure \* ARABIC ">
+        <w:r>
+          <w:rPr>
+            <w:noProof/>
+          </w:rPr>
+          <w:t>16</w:t>
+        </w:r>
+      </w:fldSimple>
       <w:r>
         <w:t xml:space="preserve"> : </w:t>
       </w:r>
@@ -6748,24 +6568,14 @@
       <w:r>
         <w:t xml:space="preserve">Figure </w:t>
       </w:r>
-      <w:r>
-        <w:fldChar w:fldCharType="begin"/>
-      </w:r>
-      <w:r>
-        <w:instrText xml:space="preserve"> SEQ Figure \* ARABIC </w:instrText>
-      </w:r>
-      <w:r>
-        <w:fldChar w:fldCharType="separate"/>
-      </w:r>
-      <w:r>
-        <w:rPr>
-          <w:noProof/>
-        </w:rPr>
-        <w:t>17</w:t>
-      </w:r>
-      <w:r>
-        <w:fldChar w:fldCharType="end"/>
-      </w:r>
+      <w:fldSimple w:instr=" SEQ Figure \* ARABIC ">
+        <w:r>
+          <w:rPr>
+            <w:noProof/>
+          </w:rPr>
+          <w:t>17</w:t>
+        </w:r>
+      </w:fldSimple>
       <w:r>
         <w:t xml:space="preserve"> : </w:t>
       </w:r>
@@ -6841,24 +6651,14 @@
       <w:r>
         <w:t xml:space="preserve">Figure </w:t>
       </w:r>
-      <w:r>
-        <w:fldChar w:fldCharType="begin"/>
-      </w:r>
-      <w:r>
-        <w:instrText xml:space="preserve"> SEQ Figure \* ARABIC </w:instrText>
-      </w:r>
-      <w:r>
-        <w:fldChar w:fldCharType="separate"/>
-      </w:r>
-      <w:r>
-        <w:rPr>
-          <w:noProof/>
-        </w:rPr>
-        <w:t>18</w:t>
-      </w:r>
-      <w:r>
-        <w:fldChar w:fldCharType="end"/>
-      </w:r>
+      <w:fldSimple w:instr=" SEQ Figure \* ARABIC ">
+        <w:r>
+          <w:rPr>
+            <w:noProof/>
+          </w:rPr>
+          <w:t>18</w:t>
+        </w:r>
+      </w:fldSimple>
       <w:r>
         <w:t xml:space="preserve"> : </w:t>
       </w:r>
@@ -6878,9 +6678,9 @@
         </w:rPr>
         <w:lastRenderedPageBreak/>
         <w:drawing>
-          <wp:inline distT="0" distB="0" distL="0" distR="0" wp14:anchorId="0C8B30E7" wp14:editId="68A471BC">
-            <wp:extent cx="2286000" cy="3490936"/>
-            <wp:effectExtent l="0" t="0" r="0" b="0"/>
+          <wp:inline distT="0" distB="0" distL="0" distR="0" wp14:anchorId="0C8B30E7" wp14:editId="2619A64E">
+            <wp:extent cx="1459071" cy="3490936"/>
+            <wp:effectExtent l="0" t="0" r="8255" b="0"/>
             <wp:docPr id="994482716" name="Image 35"/>
             <wp:cNvGraphicFramePr>
               <a:graphicFrameLocks xmlns:a="http://schemas.openxmlformats.org/drawingml/2006/main" noChangeAspect="1"/>
@@ -6889,20 +6689,19 @@
               <a:graphicData uri="http://schemas.openxmlformats.org/drawingml/2006/picture">
                 <pic:pic xmlns:pic="http://schemas.openxmlformats.org/drawingml/2006/picture">
                   <pic:nvPicPr>
-                    <pic:cNvPr id="0" name="Picture 114"/>
+                    <pic:cNvPr id="994482716" name="Image 35"/>
                     <pic:cNvPicPr>
                       <a:picLocks noChangeAspect="1" noChangeArrowheads="1"/>
                     </pic:cNvPicPr>
                   </pic:nvPicPr>
                   <pic:blipFill>
-                    <a:blip r:embed="rId27">
+                    <a:blip r:embed="rId27" cstate="print">
                       <a:extLst>
                         <a:ext uri="{28A0092B-C50C-407E-A947-70E740481C1C}">
                           <a14:useLocalDpi xmlns:a14="http://schemas.microsoft.com/office/drawing/2010/main" val="0"/>
                         </a:ext>
                       </a:extLst>
                     </a:blip>
-                    <a:srcRect/>
                     <a:stretch>
                       <a:fillRect/>
                     </a:stretch>
@@ -6910,7 +6709,7 @@
                   <pic:spPr bwMode="auto">
                     <a:xfrm>
                       <a:off x="0" y="0"/>
-                      <a:ext cx="2289738" cy="3496645"/>
+                      <a:ext cx="1459071" cy="3490936"/>
                     </a:xfrm>
                     <a:prstGeom prst="rect">
                       <a:avLst/>
@@ -6935,29 +6734,16 @@
       <w:r>
         <w:t xml:space="preserve">Figure </w:t>
       </w:r>
-      <w:r>
-        <w:fldChar w:fldCharType="begin"/>
-      </w:r>
-      <w:r>
-        <w:instrText xml:space="preserve"> SEQ Figure \* ARABIC </w:instrText>
-      </w:r>
-      <w:r>
-        <w:fldChar w:fldCharType="separate"/>
-      </w:r>
-      <w:r>
-        <w:rPr>
-          <w:noProof/>
-        </w:rPr>
-        <w:t>19</w:t>
-      </w:r>
-      <w:r>
-        <w:fldChar w:fldCharType="end"/>
-      </w:r>
-      <w:r>
-        <w:t xml:space="preserve"> : </w:t>
-      </w:r>
-      <w:r>
-        <w:t xml:space="preserve">Diagramme d’Activité - </w:t>
+      <w:fldSimple w:instr=" SEQ Figure \* ARABIC ">
+        <w:r>
+          <w:rPr>
+            <w:noProof/>
+          </w:rPr>
+          <w:t>19</w:t>
+        </w:r>
+      </w:fldSimple>
+      <w:r>
+        <w:t xml:space="preserve"> : Diagramme d’Activité - </w:t>
       </w:r>
       <w:r>
         <w:t>Processus d'envoi d'un message d'alerte WhatsApp aux contacts</w:t>
@@ -7028,29 +6814,16 @@
       <w:r>
         <w:t xml:space="preserve">Figure </w:t>
       </w:r>
-      <w:r>
-        <w:fldChar w:fldCharType="begin"/>
-      </w:r>
-      <w:r>
-        <w:instrText xml:space="preserve"> SEQ Figure \* ARABIC </w:instrText>
-      </w:r>
-      <w:r>
-        <w:fldChar w:fldCharType="separate"/>
-      </w:r>
-      <w:r>
-        <w:rPr>
-          <w:noProof/>
-        </w:rPr>
-        <w:t>20</w:t>
-      </w:r>
-      <w:r>
-        <w:fldChar w:fldCharType="end"/>
-      </w:r>
-      <w:r>
-        <w:t xml:space="preserve"> : </w:t>
-      </w:r>
-      <w:r>
-        <w:t xml:space="preserve">Diagramme d’Activité - </w:t>
+      <w:fldSimple w:instr=" SEQ Figure \* ARABIC ">
+        <w:r>
+          <w:rPr>
+            <w:noProof/>
+          </w:rPr>
+          <w:t>20</w:t>
+        </w:r>
+      </w:fldSimple>
+      <w:r>
+        <w:t xml:space="preserve"> : Diagramme d’Activité - </w:t>
       </w:r>
       <w:r>
         <w:t>Processus de consultation de la liste de contacts</w:t>
@@ -7064,9 +6837,9 @@
         </w:rPr>
         <w:lastRenderedPageBreak/>
         <w:drawing>
-          <wp:inline distT="0" distB="0" distL="0" distR="0" wp14:anchorId="66C0C99B" wp14:editId="50A159F5">
-            <wp:extent cx="3133725" cy="7350500"/>
-            <wp:effectExtent l="0" t="0" r="0" b="3175"/>
+          <wp:inline distT="0" distB="0" distL="0" distR="0" wp14:anchorId="66C0C99B" wp14:editId="2E7C235E">
+            <wp:extent cx="2981375" cy="7358578"/>
+            <wp:effectExtent l="0" t="0" r="0" b="0"/>
             <wp:docPr id="1611236353" name="Image 38"/>
             <wp:cNvGraphicFramePr>
               <a:graphicFrameLocks xmlns:a="http://schemas.openxmlformats.org/drawingml/2006/main" noChangeAspect="1"/>
@@ -7075,7 +6848,7 @@
               <a:graphicData uri="http://schemas.openxmlformats.org/drawingml/2006/picture">
                 <pic:pic xmlns:pic="http://schemas.openxmlformats.org/drawingml/2006/picture">
                   <pic:nvPicPr>
-                    <pic:cNvPr id="0" name="Picture 120"/>
+                    <pic:cNvPr id="1611236353" name="Image 38"/>
                     <pic:cNvPicPr>
                       <a:picLocks noChangeAspect="1" noChangeArrowheads="1"/>
                     </pic:cNvPicPr>
@@ -7088,7 +6861,6 @@
                         </a:ext>
                       </a:extLst>
                     </a:blip>
-                    <a:srcRect/>
                     <a:stretch>
                       <a:fillRect/>
                     </a:stretch>
@@ -7096,7 +6868,7 @@
                   <pic:spPr bwMode="auto">
                     <a:xfrm>
                       <a:off x="0" y="0"/>
-                      <a:ext cx="3137169" cy="7358578"/>
+                      <a:ext cx="2981375" cy="7358578"/>
                     </a:xfrm>
                     <a:prstGeom prst="rect">
                       <a:avLst/>
@@ -7121,29 +6893,16 @@
       <w:r>
         <w:t xml:space="preserve">Figure </w:t>
       </w:r>
-      <w:r>
-        <w:fldChar w:fldCharType="begin"/>
-      </w:r>
-      <w:r>
-        <w:instrText xml:space="preserve"> SEQ Figure \* ARABIC </w:instrText>
-      </w:r>
-      <w:r>
-        <w:fldChar w:fldCharType="separate"/>
-      </w:r>
-      <w:r>
-        <w:rPr>
-          <w:noProof/>
-        </w:rPr>
-        <w:t>21</w:t>
-      </w:r>
-      <w:r>
-        <w:fldChar w:fldCharType="end"/>
-      </w:r>
-      <w:r>
-        <w:t xml:space="preserve"> : </w:t>
-      </w:r>
-      <w:r>
-        <w:t xml:space="preserve">Diagramme d’Activité - </w:t>
+      <w:fldSimple w:instr=" SEQ Figure \* ARABIC ">
+        <w:r>
+          <w:rPr>
+            <w:noProof/>
+          </w:rPr>
+          <w:t>21</w:t>
+        </w:r>
+      </w:fldSimple>
+      <w:r>
+        <w:t xml:space="preserve"> : Diagramme d’Activité - </w:t>
       </w:r>
       <w:r>
         <w:t>Processus de transfert d'argent protégé</w:t>
@@ -7179,8 +6938,8 @@
           <w:noProof/>
         </w:rPr>
         <w:drawing>
-          <wp:inline distT="0" distB="0" distL="0" distR="0" wp14:anchorId="414D3D6B" wp14:editId="006D97BF">
-            <wp:extent cx="5759450" cy="5640705"/>
+          <wp:inline distT="0" distB="0" distL="0" distR="0" wp14:anchorId="414D3D6B" wp14:editId="3832C139">
+            <wp:extent cx="6229350" cy="5640070"/>
             <wp:effectExtent l="0" t="0" r="0" b="0"/>
             <wp:docPr id="2118196894" name="Image 39"/>
             <wp:cNvGraphicFramePr>
@@ -7190,7 +6949,7 @@
               <a:graphicData uri="http://schemas.openxmlformats.org/drawingml/2006/picture">
                 <pic:pic xmlns:pic="http://schemas.openxmlformats.org/drawingml/2006/picture">
                   <pic:nvPicPr>
-                    <pic:cNvPr id="0" name="Picture 122"/>
+                    <pic:cNvPr id="2118196894" name="Image 39"/>
                     <pic:cNvPicPr>
                       <a:picLocks noChangeAspect="1" noChangeArrowheads="1"/>
                     </pic:cNvPicPr>
@@ -7203,7 +6962,6 @@
                         </a:ext>
                       </a:extLst>
                     </a:blip>
-                    <a:srcRect/>
                     <a:stretch>
                       <a:fillRect/>
                     </a:stretch>
@@ -7211,7 +6969,7 @@
                   <pic:spPr bwMode="auto">
                     <a:xfrm>
                       <a:off x="0" y="0"/>
-                      <a:ext cx="5759450" cy="5640705"/>
+                      <a:ext cx="6241727" cy="5651276"/>
                     </a:xfrm>
                     <a:prstGeom prst="rect">
                       <a:avLst/>
@@ -7236,24 +6994,14 @@
       <w:r>
         <w:t xml:space="preserve">Figure </w:t>
       </w:r>
-      <w:r>
-        <w:fldChar w:fldCharType="begin"/>
-      </w:r>
-      <w:r>
-        <w:instrText xml:space="preserve"> SEQ Figure \* ARABIC </w:instrText>
-      </w:r>
-      <w:r>
-        <w:fldChar w:fldCharType="separate"/>
-      </w:r>
-      <w:r>
-        <w:rPr>
-          <w:noProof/>
-        </w:rPr>
-        <w:t>22</w:t>
-      </w:r>
-      <w:r>
-        <w:fldChar w:fldCharType="end"/>
-      </w:r>
+      <w:fldSimple w:instr=" SEQ Figure \* ARABIC ">
+        <w:r>
+          <w:rPr>
+            <w:noProof/>
+          </w:rPr>
+          <w:t>22</w:t>
+        </w:r>
+      </w:fldSimple>
       <w:r>
         <w:t xml:space="preserve"> : </w:t>
       </w:r>
@@ -12730,6 +12478,7 @@
   <w:style w:type="character" w:default="1" w:styleId="Policepardfaut">
     <w:name w:val="Default Paragraph Font"/>
     <w:uiPriority w:val="1"/>
+    <w:semiHidden/>
     <w:unhideWhenUsed/>
   </w:style>
   <w:style w:type="table" w:default="1" w:styleId="TableauNormal">
@@ -13293,10 +13042,14 @@
   <w:rsids>
     <w:rsidRoot w:val="00064942"/>
     <w:rsid w:val="00064942"/>
+    <w:rsid w:val="00097CEF"/>
     <w:rsid w:val="000E5400"/>
     <w:rsid w:val="006C21EF"/>
+    <w:rsid w:val="0079282A"/>
+    <w:rsid w:val="007F3646"/>
     <w:rsid w:val="00C20F9F"/>
     <w:rsid w:val="00C23B26"/>
+    <w:rsid w:val="00D60D04"/>
     <w:rsid w:val="00DC3EE3"/>
   </w:rsids>
   <m:mathPr>

</xml_diff>